<commit_message>
Use Senior Manager (Amara Raja) and Manager (TQ Cert / Tata Projects) titles; record as standing rule
Co-Authored-By: Claude Opus 5.5 <noreply@anthropic.com>
Claude-Session: https://claude.ai/code/session_01NprkEk5XUVJSnmfnKNx5TN
</commit_message>
<xml_diff>
--- a/applications/wind-site-construction-head-fatehgarh/Justin_Thomas_CV_Wind_Site_Construction_Head.docx
+++ b/applications/wind-site-construction-head-fatehgarh/Justin_Thomas_CV_Wind_Site_Construction_Head.docx
@@ -832,7 +832,7 @@
                 <w:b/>
                 <w:color w:val="123A5E"/>
               </w:rPr>
-              <w:t>Manager – Electrical Projects</w:t>
+              <w:t>Senior Manager – Electrical Projects</w:t>
             </w:r>
             <w:r>
               <w:rPr>
@@ -936,7 +936,7 @@
                 <w:b/>
                 <w:color w:val="123A5E"/>
               </w:rPr>
-              <w:t>Owner's Engineer – Quality &amp; Inspection</w:t>
+              <w:t>Manager – Owner's Engineer, Quality &amp; Inspection</w:t>
             </w:r>
             <w:r>
               <w:rPr>

</xml_diff>